<commit_message>
chinh sua lan cuoi
</commit_message>
<xml_diff>
--- a/Report.docx
+++ b/Report.docx
@@ -11,63 +11,7 @@
           <w:b/>
           <w:sz w:val="32"/>
         </w:rPr>
-        <w:t>BÁO CÁO K</w:t>
-      </w:r>
-      <w:r>
-        <w:rPr>
-          <w:b/>
-          <w:sz w:val="32"/>
-        </w:rPr>
-        <w:t>Ế</w:t>
-      </w:r>
-      <w:r>
-        <w:rPr>
-          <w:b/>
-          <w:sz w:val="32"/>
-        </w:rPr>
-        <w:t>T QU</w:t>
-      </w:r>
-      <w:r>
-        <w:rPr>
-          <w:b/>
-          <w:sz w:val="32"/>
-        </w:rPr>
-        <w:t>Ả</w:t>
-      </w:r>
-      <w:r>
-        <w:rPr>
-          <w:b/>
-          <w:sz w:val="32"/>
-        </w:rPr>
-        <w:t xml:space="preserve"> TH</w:t>
-      </w:r>
-      <w:r>
-        <w:rPr>
-          <w:b/>
-          <w:sz w:val="32"/>
-        </w:rPr>
-        <w:t>Ử</w:t>
-      </w:r>
-      <w:r>
-        <w:rPr>
-          <w:b/>
-          <w:sz w:val="32"/>
-        </w:rPr>
-        <w:t xml:space="preserve"> NGHI</w:t>
-      </w:r>
-      <w:r>
-        <w:rPr>
-          <w:b/>
-          <w:sz w:val="32"/>
-        </w:rPr>
-        <w:t>Ệ</w:t>
-      </w:r>
-      <w:r>
-        <w:rPr>
-          <w:b/>
-          <w:sz w:val="32"/>
-        </w:rPr>
-        <w:t>M</w:t>
+        <w:t>BÁO CÁO KẾT QUẢ THỬ NGHIỆM</w:t>
       </w:r>
       <w:r>
         <w:rPr>
@@ -82,40 +26,10 @@
         <w:rPr>
           <w:b/>
         </w:rPr>
-        <w:t>Sinh viên th</w:t>
+        <w:t xml:space="preserve">Sinh viên thực hiện: </w:t>
       </w:r>
       <w:r>
-        <w:rPr>
-          <w:b/>
-        </w:rPr>
-        <w:t>ự</w:t>
-      </w:r>
-      <w:r>
-        <w:rPr>
-          <w:b/>
-        </w:rPr>
-        <w:t>c hi</w:t>
-      </w:r>
-      <w:r>
-        <w:rPr>
-          <w:b/>
-        </w:rPr>
-        <w:t>ệ</w:t>
-      </w:r>
-      <w:r>
-        <w:rPr>
-          <w:b/>
-        </w:rPr>
-        <w:t xml:space="preserve">n: </w:t>
-      </w:r>
-      <w:r>
-        <w:t>Nguy</w:t>
-      </w:r>
-      <w:r>
-        <w:t>ễ</w:t>
-      </w:r>
-      <w:r>
-        <w:t>n Minh Khang</w:t>
+        <w:t>Nguyễn Minh Khang</w:t>
       </w:r>
       <w:r>
         <w:br/>
@@ -124,19 +38,7 @@
         <w:rPr>
           <w:b/>
         </w:rPr>
-        <w:t>L</w:t>
-      </w:r>
-      <w:r>
-        <w:rPr>
-          <w:b/>
-        </w:rPr>
-        <w:t>ớ</w:t>
-      </w:r>
-      <w:r>
-        <w:rPr>
-          <w:b/>
-        </w:rPr>
-        <w:t xml:space="preserve">p: </w:t>
+        <w:t xml:space="preserve">Lớp: </w:t>
       </w:r>
       <w:r>
         <w:t>TTNT2025</w:t>
@@ -170,375 +72,24 @@
           <w:t>https://github.com/POG42069/SortingAlgorithm</w:t>
         </w:r>
       </w:hyperlink>
+      <w:r>
+        <w:rPr>
+          <w:rStyle w:val="Hyperlink"/>
+        </w:rPr>
+        <w:t xml:space="preserve"> </w:t>
+      </w:r>
+      <w:bookmarkStart w:id="0" w:name="_GoBack"/>
+      <w:bookmarkEnd w:id="0"/>
     </w:p>
     <w:p>
       <w:r>
         <w:rPr>
           <w:b/>
         </w:rPr>
-        <w:t>N</w:t>
+        <w:t xml:space="preserve">Nội dung báo cáo: </w:t>
       </w:r>
       <w:r>
-        <w:rPr>
-          <w:b/>
-        </w:rPr>
-        <w:t>ộ</w:t>
-      </w:r>
-      <w:r>
-        <w:rPr>
-          <w:b/>
-        </w:rPr>
-        <w:t xml:space="preserve">i dung báo cáo: </w:t>
-      </w:r>
-      <w:r>
-        <w:t>Tài li</w:t>
-      </w:r>
-      <w:r>
-        <w:t>ệ</w:t>
-      </w:r>
-      <w:r>
-        <w:t>u này trình bày các đánh giá chi ti</w:t>
-      </w:r>
-      <w:r>
-        <w:t>ế</w:t>
-      </w:r>
-      <w:r>
-        <w:t>t v</w:t>
-      </w:r>
-      <w:r>
-        <w:t>ề</w:t>
-      </w:r>
-      <w:r>
-        <w:t xml:space="preserve"> hi</w:t>
-      </w:r>
-      <w:r>
-        <w:t>ệ</w:t>
-      </w:r>
-      <w:r>
-        <w:t>u su</w:t>
-      </w:r>
-      <w:r>
-        <w:t>ấ</w:t>
-      </w:r>
-      <w:r>
-        <w:t>t ho</w:t>
-      </w:r>
-      <w:r>
-        <w:t>ạ</w:t>
-      </w:r>
-      <w:r>
-        <w:t>t đ</w:t>
-      </w:r>
-      <w:r>
-        <w:t>ộ</w:t>
-      </w:r>
-      <w:r>
-        <w:t>ng c</w:t>
-      </w:r>
-      <w:r>
-        <w:t>ủ</w:t>
-      </w:r>
-      <w:r>
-        <w:t>a b</w:t>
-      </w:r>
-      <w:r>
-        <w:t>ố</w:t>
-      </w:r>
-      <w:r>
-        <w:t>n thu</w:t>
-      </w:r>
-      <w:r>
-        <w:t>ậ</w:t>
-      </w:r>
-      <w:r>
-        <w:t xml:space="preserve">t </w:t>
-      </w:r>
-      <w:r>
-        <w:t>toán s</w:t>
-      </w:r>
-      <w:r>
-        <w:t>ắ</w:t>
-      </w:r>
-      <w:r>
-        <w:t>p x</w:t>
-      </w:r>
-      <w:r>
-        <w:t>ế</w:t>
-      </w:r>
-      <w:r>
-        <w:t>p bao g</w:t>
-      </w:r>
-      <w:r>
-        <w:t>ồ</w:t>
-      </w:r>
-      <w:r>
-        <w:t>m: Qui</w:t>
-      </w:r>
-      <w:bookmarkStart w:id="0" w:name="_GoBack"/>
-      <w:bookmarkEnd w:id="0"/>
-      <w:r>
-        <w:t>ckSort, HeapSort, MergeSort và hàm s</w:t>
-      </w:r>
-      <w:r>
-        <w:t>ắ</w:t>
-      </w:r>
-      <w:r>
-        <w:t>p x</w:t>
-      </w:r>
-      <w:r>
-        <w:t>ế</w:t>
-      </w:r>
-      <w:r>
-        <w:t>p có s</w:t>
-      </w:r>
-      <w:r>
-        <w:t>ẵ</w:t>
-      </w:r>
-      <w:r>
-        <w:t>n c</w:t>
-      </w:r>
-      <w:r>
-        <w:t>ủ</w:t>
-      </w:r>
-      <w:r>
-        <w:t>a NumPy. Quá trình ki</w:t>
-      </w:r>
-      <w:r>
-        <w:t>ể</w:t>
-      </w:r>
-      <w:r>
-        <w:t>m th</w:t>
-      </w:r>
-      <w:r>
-        <w:t>ử</w:t>
-      </w:r>
-      <w:r>
-        <w:t xml:space="preserve"> đư</w:t>
-      </w:r>
-      <w:r>
-        <w:t>ợ</w:t>
-      </w:r>
-      <w:r>
-        <w:t>c ti</w:t>
-      </w:r>
-      <w:r>
-        <w:t>ế</w:t>
-      </w:r>
-      <w:r>
-        <w:t>n hành trên 10 t</w:t>
-      </w:r>
-      <w:r>
-        <w:t>ậ</w:t>
-      </w:r>
-      <w:r>
-        <w:t>p d</w:t>
-      </w:r>
-      <w:r>
-        <w:t>ữ</w:t>
-      </w:r>
-      <w:r>
-        <w:t xml:space="preserve"> li</w:t>
-      </w:r>
-      <w:r>
-        <w:t>ệ</w:t>
-      </w:r>
-      <w:r>
-        <w:t>u khác nhau (m</w:t>
-      </w:r>
-      <w:r>
-        <w:t>ỗ</w:t>
-      </w:r>
-      <w:r>
-        <w:t>i t</w:t>
-      </w:r>
-      <w:r>
-        <w:t>ậ</w:t>
-      </w:r>
-      <w:r>
-        <w:t>p ch</w:t>
-      </w:r>
-      <w:r>
-        <w:t>ứ</w:t>
-      </w:r>
-      <w:r>
-        <w:t>a 10^6 ph</w:t>
-      </w:r>
-      <w:r>
-        <w:t>ầ</w:t>
-      </w:r>
-      <w:r>
-        <w:t>n t</w:t>
-      </w:r>
-      <w:r>
-        <w:t>ử</w:t>
-      </w:r>
-      <w:r>
-        <w:t>), bao ph</w:t>
-      </w:r>
-      <w:r>
-        <w:t>ủ</w:t>
-      </w:r>
-      <w:r>
-        <w:t xml:space="preserve"> các trư</w:t>
-      </w:r>
-      <w:r>
-        <w:t>ờ</w:t>
-      </w:r>
-      <w:r>
-        <w:t>ng h</w:t>
-      </w:r>
-      <w:r>
-        <w:t>ợ</w:t>
-      </w:r>
-      <w:r>
-        <w:t>p m</w:t>
-      </w:r>
-      <w:r>
-        <w:t>ả</w:t>
-      </w:r>
-      <w:r>
-        <w:t>ng ng</w:t>
-      </w:r>
-      <w:r>
-        <w:t>ẫ</w:t>
-      </w:r>
-      <w:r>
-        <w:t>u nhiên, m</w:t>
-      </w:r>
-      <w:r>
-        <w:t>ả</w:t>
-      </w:r>
-      <w:r>
-        <w:t>ng đã s</w:t>
-      </w:r>
-      <w:r>
-        <w:t>ắ</w:t>
-      </w:r>
-      <w:r>
-        <w:t>p x</w:t>
-      </w:r>
-      <w:r>
-        <w:t>ế</w:t>
-      </w:r>
-      <w:r>
-        <w:t>p tăng và gi</w:t>
-      </w:r>
-      <w:r>
-        <w:t>ả</w:t>
-      </w:r>
-      <w:r>
-        <w:t>m d</w:t>
-      </w:r>
-      <w:r>
-        <w:t>ầ</w:t>
-      </w:r>
-      <w:r>
-        <w:t>n. Thô</w:t>
-      </w:r>
-      <w:r>
-        <w:t>ng qua s</w:t>
-      </w:r>
-      <w:r>
-        <w:t>ố</w:t>
-      </w:r>
-      <w:r>
-        <w:t xml:space="preserve"> li</w:t>
-      </w:r>
-      <w:r>
-        <w:t>ệ</w:t>
-      </w:r>
-      <w:r>
-        <w:t>u th</w:t>
-      </w:r>
-      <w:r>
-        <w:t>ố</w:t>
-      </w:r>
-      <w:r>
-        <w:t>ng kê và bi</w:t>
-      </w:r>
-      <w:r>
-        <w:t>ể</w:t>
-      </w:r>
-      <w:r>
-        <w:t>u đ</w:t>
-      </w:r>
-      <w:r>
-        <w:t>ồ</w:t>
-      </w:r>
-      <w:r>
-        <w:t xml:space="preserve"> tr</w:t>
-      </w:r>
-      <w:r>
-        <w:t>ự</w:t>
-      </w:r>
-      <w:r>
-        <w:t>c quan, báo cáo s</w:t>
-      </w:r>
-      <w:r>
-        <w:t>ẽ</w:t>
-      </w:r>
-      <w:r>
-        <w:t xml:space="preserve"> phân tích t</w:t>
-      </w:r>
-      <w:r>
-        <w:t>ố</w:t>
-      </w:r>
-      <w:r>
-        <w:t>c đ</w:t>
-      </w:r>
-      <w:r>
-        <w:t>ộ</w:t>
-      </w:r>
-      <w:r>
-        <w:t xml:space="preserve"> th</w:t>
-      </w:r>
-      <w:r>
-        <w:t>ự</w:t>
-      </w:r>
-      <w:r>
-        <w:t>c thi cũng như đ</w:t>
-      </w:r>
-      <w:r>
-        <w:t>ộ</w:t>
-      </w:r>
-      <w:r>
-        <w:t xml:space="preserve"> </w:t>
-      </w:r>
-      <w:r>
-        <w:t>ổ</w:t>
-      </w:r>
-      <w:r>
-        <w:t>n đ</w:t>
-      </w:r>
-      <w:r>
-        <w:t>ị</w:t>
-      </w:r>
-      <w:r>
-        <w:t>nh c</w:t>
-      </w:r>
-      <w:r>
-        <w:t>ủ</w:t>
-      </w:r>
-      <w:r>
-        <w:t>a t</w:t>
-      </w:r>
-      <w:r>
-        <w:t>ừ</w:t>
-      </w:r>
-      <w:r>
-        <w:t>ng phương pháp so v</w:t>
-      </w:r>
-      <w:r>
-        <w:t>ớ</w:t>
-      </w:r>
-      <w:r>
-        <w:t>i lý thuy</w:t>
-      </w:r>
-      <w:r>
-        <w:t>ế</w:t>
-      </w:r>
-      <w:r>
-        <w:t>t.</w:t>
+        <w:t>Tài liệu này trình bày các đánh giá chi tiết về hiệu suất hoạt động của bốn thuật toán sắp xếp bao gồm: QuickSort, HeapSort, MergeSort và hàm sắp xếp có sẵn của NumPy. Quá trình kiểm thử được tiến hành trên 10 tập dữ liệu khác nhau (mỗi tập chứa 10^6 phần tử), bao phủ các trường hợp mảng ngẫu nhiên, mảng đã sắp xếp tăng và giảm dần. Thông qua số liệu thống kê và biểu đồ trực quan, báo cáo sẽ phân tích tốc độ thực thi cũng như độ ổn định của từng phương pháp so với lý thuyết.</w:t>
       </w:r>
     </w:p>
     <w:p>
@@ -546,31 +97,7 @@
         <w:pStyle w:val="Heading1"/>
       </w:pPr>
       <w:r>
-        <w:t>1. K</w:t>
-      </w:r>
-      <w:r>
-        <w:t>ế</w:t>
-      </w:r>
-      <w:r>
-        <w:t>t qu</w:t>
-      </w:r>
-      <w:r>
-        <w:t>ả</w:t>
-      </w:r>
-      <w:r>
-        <w:t xml:space="preserve"> th</w:t>
-      </w:r>
-      <w:r>
-        <w:t>ử</w:t>
-      </w:r>
-      <w:r>
-        <w:t xml:space="preserve"> nghi</w:t>
-      </w:r>
-      <w:r>
-        <w:t>ệ</w:t>
-      </w:r>
-      <w:r>
-        <w:t>m</w:t>
+        <w:t>1. Kết quả thử nghiệm</w:t>
       </w:r>
     </w:p>
     <w:p>
@@ -578,55 +105,7 @@
         <w:rPr>
           <w:b/>
         </w:rPr>
-        <w:t>1. B</w:t>
-      </w:r>
-      <w:r>
-        <w:rPr>
-          <w:b/>
-        </w:rPr>
-        <w:t>ả</w:t>
-      </w:r>
-      <w:r>
-        <w:rPr>
-          <w:b/>
-        </w:rPr>
-        <w:t>ng th</w:t>
-      </w:r>
-      <w:r>
-        <w:rPr>
-          <w:b/>
-        </w:rPr>
-        <w:t>ờ</w:t>
-      </w:r>
-      <w:r>
-        <w:rPr>
-          <w:b/>
-        </w:rPr>
-        <w:t>i gian th</w:t>
-      </w:r>
-      <w:r>
-        <w:rPr>
-          <w:b/>
-        </w:rPr>
-        <w:t>ự</w:t>
-      </w:r>
-      <w:r>
-        <w:rPr>
-          <w:b/>
-        </w:rPr>
-        <w:t>c hi</w:t>
-      </w:r>
-      <w:r>
-        <w:rPr>
-          <w:b/>
-        </w:rPr>
-        <w:t>ệ</w:t>
-      </w:r>
-      <w:r>
-        <w:rPr>
-          <w:b/>
-        </w:rPr>
-        <w:t>n</w:t>
+        <w:t>1. Bảng thời gian thực hiện</w:t>
       </w:r>
     </w:p>
     <w:tbl>
@@ -655,31 +134,7 @@
               <w:rPr>
                 <w:b/>
               </w:rPr>
-              <w:t>D</w:t>
-            </w:r>
-            <w:r>
-              <w:rPr>
-                <w:b/>
-              </w:rPr>
-              <w:t>ữ</w:t>
-            </w:r>
-            <w:r>
-              <w:rPr>
-                <w:b/>
-              </w:rPr>
-              <w:t xml:space="preserve"> li</w:t>
-            </w:r>
-            <w:r>
-              <w:rPr>
-                <w:b/>
-              </w:rPr>
-              <w:t>ệ</w:t>
-            </w:r>
-            <w:r>
-              <w:rPr>
-                <w:b/>
-              </w:rPr>
-              <w:t>u</w:t>
+              <w:t>Dữ liệu</w:t>
             </w:r>
           </w:p>
         </w:tc>
@@ -743,13 +198,7 @@
               <w:rPr>
                 <w:b/>
               </w:rPr>
-              <w:t>NumPy Sort (</w:t>
-            </w:r>
-            <w:r>
-              <w:rPr>
-                <w:b/>
-              </w:rPr>
-              <w:t>ms)</w:t>
+              <w:t>NumPy Sort (ms)</w:t>
             </w:r>
           </w:p>
         </w:tc>
@@ -1381,79 +830,7 @@
         <w:rPr>
           <w:b/>
         </w:rPr>
-        <w:t>2. Bi</w:t>
-      </w:r>
-      <w:r>
-        <w:rPr>
-          <w:b/>
-        </w:rPr>
-        <w:t>ể</w:t>
-      </w:r>
-      <w:r>
-        <w:rPr>
-          <w:b/>
-        </w:rPr>
-        <w:t>u đ</w:t>
-      </w:r>
-      <w:r>
-        <w:rPr>
-          <w:b/>
-        </w:rPr>
-        <w:t>ồ</w:t>
-      </w:r>
-      <w:r>
-        <w:rPr>
-          <w:b/>
-        </w:rPr>
-        <w:t xml:space="preserve"> (c</w:t>
-      </w:r>
-      <w:r>
-        <w:rPr>
-          <w:b/>
-        </w:rPr>
-        <w:t>ộ</w:t>
-      </w:r>
-      <w:r>
-        <w:rPr>
-          <w:b/>
-        </w:rPr>
-        <w:t>t) th</w:t>
-      </w:r>
-      <w:r>
-        <w:rPr>
-          <w:b/>
-        </w:rPr>
-        <w:t>ờ</w:t>
-      </w:r>
-      <w:r>
-        <w:rPr>
-          <w:b/>
-        </w:rPr>
-        <w:t>i gian th</w:t>
-      </w:r>
-      <w:r>
-        <w:rPr>
-          <w:b/>
-        </w:rPr>
-        <w:t>ự</w:t>
-      </w:r>
-      <w:r>
-        <w:rPr>
-          <w:b/>
-        </w:rPr>
-        <w:t>c hi</w:t>
-      </w:r>
-      <w:r>
-        <w:rPr>
-          <w:b/>
-        </w:rPr>
-        <w:t>ệ</w:t>
-      </w:r>
-      <w:r>
-        <w:rPr>
-          <w:b/>
-        </w:rPr>
-        <w:t>n</w:t>
+        <w:t>2. Biểu đồ (cột) thời gian thực hiện</w:t>
       </w:r>
     </w:p>
     <w:p>
@@ -1507,61 +884,7 @@
         <w:jc w:val="center"/>
       </w:pPr>
       <w:r>
-        <w:t>Bi</w:t>
-      </w:r>
-      <w:r>
-        <w:t>ể</w:t>
-      </w:r>
-      <w:r>
-        <w:t>u đ</w:t>
-      </w:r>
-      <w:r>
-        <w:t>ồ</w:t>
-      </w:r>
-      <w:r>
-        <w:t xml:space="preserve"> 1: K</w:t>
-      </w:r>
-      <w:r>
-        <w:t>ế</w:t>
-      </w:r>
-      <w:r>
-        <w:t>t qu</w:t>
-      </w:r>
-      <w:r>
-        <w:t>ả</w:t>
-      </w:r>
-      <w:r>
-        <w:t xml:space="preserve"> th</w:t>
-      </w:r>
-      <w:r>
-        <w:t>ử</w:t>
-      </w:r>
-      <w:r>
-        <w:t xml:space="preserve"> nghi</w:t>
-      </w:r>
-      <w:r>
-        <w:t>ệ</w:t>
-      </w:r>
-      <w:r>
-        <w:t>m trên b</w:t>
-      </w:r>
-      <w:r>
-        <w:t>ộ</w:t>
-      </w:r>
-      <w:r>
-        <w:t xml:space="preserve"> d</w:t>
-      </w:r>
-      <w:r>
-        <w:t>ữ</w:t>
-      </w:r>
-      <w:r>
-        <w:t xml:space="preserve"> li</w:t>
-      </w:r>
-      <w:r>
-        <w:t>ệ</w:t>
-      </w:r>
-      <w:r>
-        <w:t>u</w:t>
+        <w:t>Biểu đồ 1: Kết quả thử nghiệm trên bộ dữ liệu</w:t>
       </w:r>
     </w:p>
     <w:p>
@@ -1569,123 +892,12 @@
         <w:pStyle w:val="Heading1"/>
       </w:pPr>
       <w:r>
-        <w:t>2. K</w:t>
-      </w:r>
-      <w:r>
-        <w:t>ế</w:t>
-      </w:r>
-      <w:r>
-        <w:t>t lu</w:t>
-      </w:r>
-      <w:r>
-        <w:t>ậ</w:t>
-      </w:r>
-      <w:r>
-        <w:t>n</w:t>
+        <w:t>2. Kết luận</w:t>
       </w:r>
     </w:p>
     <w:p>
       <w:r>
-        <w:t>D</w:t>
-      </w:r>
-      <w:r>
-        <w:t>ự</w:t>
-      </w:r>
-      <w:r>
-        <w:t>a trên s</w:t>
-      </w:r>
-      <w:r>
-        <w:t>ố</w:t>
-      </w:r>
-      <w:r>
-        <w:t xml:space="preserve"> li</w:t>
-      </w:r>
-      <w:r>
-        <w:t>ệ</w:t>
-      </w:r>
-      <w:r>
-        <w:t>u đo lư</w:t>
-      </w:r>
-      <w:r>
-        <w:t>ờ</w:t>
-      </w:r>
-      <w:r>
-        <w:t xml:space="preserve">ng </w:t>
-      </w:r>
-      <w:r>
-        <w:t>thu đư</w:t>
-      </w:r>
-      <w:r>
-        <w:t>ợ</w:t>
-      </w:r>
-      <w:r>
-        <w:t>c t</w:t>
-      </w:r>
-      <w:r>
-        <w:t>ừ</w:t>
-      </w:r>
-      <w:r>
-        <w:t xml:space="preserve"> 10 b</w:t>
-      </w:r>
-      <w:r>
-        <w:t>ộ</w:t>
-      </w:r>
-      <w:r>
-        <w:t xml:space="preserve"> d</w:t>
-      </w:r>
-      <w:r>
-        <w:t>ữ</w:t>
-      </w:r>
-      <w:r>
-        <w:t xml:space="preserve"> li</w:t>
-      </w:r>
-      <w:r>
-        <w:t>ệ</w:t>
-      </w:r>
-      <w:r>
-        <w:t>u mô ph</w:t>
-      </w:r>
-      <w:r>
-        <w:t>ỏ</w:t>
-      </w:r>
-      <w:r>
-        <w:t>ng, có th</w:t>
-      </w:r>
-      <w:r>
-        <w:t>ể</w:t>
-      </w:r>
-      <w:r>
-        <w:t xml:space="preserve"> rút ra m</w:t>
-      </w:r>
-      <w:r>
-        <w:t>ộ</w:t>
-      </w:r>
-      <w:r>
-        <w:t>t s</w:t>
-      </w:r>
-      <w:r>
-        <w:t>ố</w:t>
-      </w:r>
-      <w:r>
-        <w:t xml:space="preserve"> nh</w:t>
-      </w:r>
-      <w:r>
-        <w:t>ậ</w:t>
-      </w:r>
-      <w:r>
-        <w:t>n đ</w:t>
-      </w:r>
-      <w:r>
-        <w:t>ị</w:t>
-      </w:r>
-      <w:r>
-        <w:t>nh chi ti</w:t>
-      </w:r>
-      <w:r>
-        <w:t>ế</w:t>
-      </w:r>
-      <w:r>
-        <w:t>t như sau:</w:t>
+        <w:t>Dựa trên số liệu đo lường thu được từ 10 bộ dữ liệu mô phỏng, có thể rút ra một số nhận định chi tiết như sau:</w:t>
       </w:r>
     </w:p>
     <w:p>
@@ -1693,493 +905,28 @@
         <w:rPr>
           <w:b/>
         </w:rPr>
-        <w:t>1. Đánh giá hi</w:t>
-      </w:r>
-      <w:r>
-        <w:rPr>
-          <w:b/>
-        </w:rPr>
-        <w:t>ệ</w:t>
-      </w:r>
-      <w:r>
-        <w:rPr>
-          <w:b/>
-        </w:rPr>
-        <w:t>u năng và t</w:t>
-      </w:r>
-      <w:r>
-        <w:rPr>
-          <w:b/>
-        </w:rPr>
-        <w:t>ố</w:t>
-      </w:r>
-      <w:r>
-        <w:rPr>
-          <w:b/>
-        </w:rPr>
-        <w:t>c đ</w:t>
-      </w:r>
-      <w:r>
-        <w:rPr>
-          <w:b/>
-        </w:rPr>
-        <w:t>ộ</w:t>
+        <w:t>1. Đánh giá hiệu năng và tốc độ</w:t>
       </w:r>
     </w:p>
     <w:p>
       <w:r>
-        <w:t>Quá trình đo lư</w:t>
-      </w:r>
-      <w:r>
-        <w:t>ờ</w:t>
-      </w:r>
-      <w:r>
-        <w:t>ng cho th</w:t>
-      </w:r>
-      <w:r>
-        <w:t>ấ</w:t>
-      </w:r>
-      <w:r>
-        <w:t>y s</w:t>
-      </w:r>
-      <w:r>
-        <w:t>ự</w:t>
-      </w:r>
-      <w:r>
-        <w:t xml:space="preserve"> phân hóa c</w:t>
-      </w:r>
-      <w:r>
-        <w:t>ự</w:t>
-      </w:r>
-      <w:r>
-        <w:t>c k</w:t>
-      </w:r>
-      <w:r>
-        <w:t>ỳ</w:t>
-      </w:r>
-      <w:r>
-        <w:t xml:space="preserve"> rõ nét v</w:t>
-      </w:r>
-      <w:r>
-        <w:t>ề</w:t>
-      </w:r>
-      <w:r>
-        <w:t xml:space="preserve"> m</w:t>
-      </w:r>
-      <w:r>
-        <w:t>ặ</w:t>
-      </w:r>
-      <w:r>
-        <w:t>t th</w:t>
-      </w:r>
-      <w:r>
-        <w:t>ờ</w:t>
-      </w:r>
-      <w:r>
-        <w:t>i gian th</w:t>
-      </w:r>
-      <w:r>
-        <w:t>ự</w:t>
-      </w:r>
-      <w:r>
-        <w:t>c thi c</w:t>
-      </w:r>
-      <w:r>
-        <w:t>ủ</w:t>
-      </w:r>
-      <w:r>
-        <w:t>a t</w:t>
-      </w:r>
-      <w:r>
-        <w:t>ừ</w:t>
-      </w:r>
-      <w:r>
-        <w:t>ng phương pháp:</w:t>
+        <w:t>Quá trình đo lường cho thấy sự phân hóa cực kỳ rõ nét về mặt thời gian thực thi của từng phương pháp:</w:t>
       </w:r>
       <w:r>
         <w:br/>
-        <w:t>- NumPy Sort: Th</w:t>
-      </w:r>
-      <w:r>
-        <w:t>ể</w:t>
-      </w:r>
-      <w:r>
-        <w:t xml:space="preserve"> hi</w:t>
-      </w:r>
-      <w:r>
-        <w:t>ệ</w:t>
-      </w:r>
-      <w:r>
-        <w:t>n s</w:t>
-      </w:r>
-      <w:r>
-        <w:t>ứ</w:t>
-      </w:r>
-      <w:r>
-        <w:t>c m</w:t>
-      </w:r>
-      <w:r>
-        <w:t>ạ</w:t>
-      </w:r>
-      <w:r>
-        <w:t>nh vư</w:t>
-      </w:r>
-      <w:r>
-        <w:t>ợ</w:t>
-      </w:r>
-      <w:r>
-        <w:t xml:space="preserve">t </w:t>
-      </w:r>
-      <w:r>
-        <w:t>tr</w:t>
-      </w:r>
-      <w:r>
-        <w:t>ộ</w:t>
-      </w:r>
-      <w:r>
-        <w:t>i v</w:t>
-      </w:r>
-      <w:r>
-        <w:t>ớ</w:t>
-      </w:r>
-      <w:r>
-        <w:t>i th</w:t>
-      </w:r>
-      <w:r>
-        <w:t>ờ</w:t>
-      </w:r>
-      <w:r>
-        <w:t>i gian trung bình ch</w:t>
-      </w:r>
-      <w:r>
-        <w:t>ỉ</w:t>
-      </w:r>
-      <w:r>
-        <w:t xml:space="preserve"> kho</w:t>
-      </w:r>
-      <w:r>
-        <w:t>ả</w:t>
-      </w:r>
-      <w:r>
-        <w:t>ng 7.89 ms. T</w:t>
-      </w:r>
-      <w:r>
-        <w:t>ố</w:t>
-      </w:r>
-      <w:r>
-        <w:t>c đ</w:t>
-      </w:r>
-      <w:r>
-        <w:t>ộ</w:t>
-      </w:r>
-      <w:r>
-        <w:t xml:space="preserve"> này g</w:t>
-      </w:r>
-      <w:r>
-        <w:t>ầ</w:t>
-      </w:r>
-      <w:r>
-        <w:t xml:space="preserve">n như đáp </w:t>
-      </w:r>
-      <w:r>
-        <w:t>ứ</w:t>
-      </w:r>
-      <w:r>
-        <w:t>ng t</w:t>
-      </w:r>
-      <w:r>
-        <w:t>ứ</w:t>
-      </w:r>
-      <w:r>
-        <w:t>c th</w:t>
-      </w:r>
-      <w:r>
-        <w:t>ờ</w:t>
-      </w:r>
-      <w:r>
-        <w:t>i nh</w:t>
-      </w:r>
-      <w:r>
-        <w:t>ờ</w:t>
-      </w:r>
-      <w:r>
-        <w:t xml:space="preserve"> vi</w:t>
-      </w:r>
-      <w:r>
-        <w:t>ệ</w:t>
-      </w:r>
-      <w:r>
-        <w:t>c thư vi</w:t>
-      </w:r>
-      <w:r>
-        <w:t>ệ</w:t>
-      </w:r>
-      <w:r>
-        <w:t>n đư</w:t>
-      </w:r>
-      <w:r>
-        <w:t>ợ</w:t>
-      </w:r>
-      <w:r>
-        <w:t>c t</w:t>
-      </w:r>
-      <w:r>
-        <w:t>ố</w:t>
-      </w:r>
-      <w:r>
-        <w:t>i ưu hóa sâu b</w:t>
-      </w:r>
-      <w:r>
-        <w:t>ằ</w:t>
-      </w:r>
-      <w:r>
-        <w:t>ng ngôn ng</w:t>
-      </w:r>
-      <w:r>
-        <w:t>ữ</w:t>
-      </w:r>
-      <w:r>
-        <w:t xml:space="preserve"> C dư</w:t>
-      </w:r>
-      <w:r>
-        <w:t>ớ</w:t>
-      </w:r>
-      <w:r>
-        <w:t>i n</w:t>
-      </w:r>
-      <w:r>
-        <w:t>ề</w:t>
-      </w:r>
-      <w:r>
-        <w:t>n t</w:t>
-      </w:r>
-      <w:r>
-        <w:t>ả</w:t>
-      </w:r>
-      <w:r>
-        <w:t>ng.</w:t>
+        <w:t>- NumPy Sort: Thể hiện sức mạnh vượt trội với thời gian trung bình chỉ khoảng 7.89 ms. Tốc độ này gần như đáp ứng tức thời nhờ việc thư viện được tối ưu hóa sâu bằng ngôn ngữ C dưới nền tảng.</w:t>
       </w:r>
       <w:r>
         <w:br/>
-        <w:t>- QuickSort: Là gi</w:t>
-      </w:r>
-      <w:r>
-        <w:t>ả</w:t>
-      </w:r>
-      <w:r>
-        <w:t>i pháp nhanh nh</w:t>
-      </w:r>
-      <w:r>
-        <w:t>ấ</w:t>
-      </w:r>
-      <w:r>
-        <w:t>t trong s</w:t>
-      </w:r>
-      <w:r>
-        <w:t>ố</w:t>
-      </w:r>
-      <w:r>
-        <w:t xml:space="preserve"> các thu</w:t>
-      </w:r>
-      <w:r>
-        <w:t>ậ</w:t>
-      </w:r>
-      <w:r>
-        <w:t>t toán t</w:t>
-      </w:r>
-      <w:r>
-        <w:t>ự</w:t>
-      </w:r>
-      <w:r>
-        <w:t xml:space="preserve"> tri</w:t>
-      </w:r>
-      <w:r>
-        <w:t>ể</w:t>
-      </w:r>
-      <w:r>
-        <w:t>n khai (m</w:t>
-      </w:r>
-      <w:r>
-        <w:t>ấ</w:t>
-      </w:r>
-      <w:r>
-        <w:t>t trung bình 4944.72 ms</w:t>
-      </w:r>
-      <w:r>
-        <w:t>).</w:t>
+        <w:t>- QuickSort: Là giải pháp nhanh nhất trong số các thuật toán tự triển khai (mất trung bình 4944.72 ms).</w:t>
       </w:r>
       <w:r>
         <w:br/>
-        <w:t>- MergeSort: Bám sát ngay sau QuickSort v</w:t>
-      </w:r>
-      <w:r>
-        <w:t>ớ</w:t>
-      </w:r>
-      <w:r>
-        <w:t>i 5076.43 ms. S</w:t>
-      </w:r>
-      <w:r>
-        <w:t>ự</w:t>
-      </w:r>
-      <w:r>
-        <w:t xml:space="preserve"> chênh l</w:t>
-      </w:r>
-      <w:r>
-        <w:t>ệ</w:t>
-      </w:r>
-      <w:r>
-        <w:t>ch nh</w:t>
-      </w:r>
-      <w:r>
-        <w:t>ẹ</w:t>
-      </w:r>
-      <w:r>
-        <w:t xml:space="preserve"> này ch</w:t>
-      </w:r>
-      <w:r>
-        <w:t>ủ</w:t>
-      </w:r>
-      <w:r>
-        <w:t xml:space="preserve"> y</w:t>
-      </w:r>
-      <w:r>
-        <w:t>ế</w:t>
-      </w:r>
-      <w:r>
-        <w:t>u đ</w:t>
-      </w:r>
-      <w:r>
-        <w:t>ế</w:t>
-      </w:r>
-      <w:r>
-        <w:t>n t</w:t>
-      </w:r>
-      <w:r>
-        <w:t>ừ</w:t>
-      </w:r>
-      <w:r>
-        <w:t xml:space="preserve"> vi</w:t>
-      </w:r>
-      <w:r>
-        <w:t>ệ</w:t>
-      </w:r>
-      <w:r>
-        <w:t>c MergeSort ph</w:t>
-      </w:r>
-      <w:r>
-        <w:t>ả</w:t>
-      </w:r>
-      <w:r>
-        <w:t>i liên t</w:t>
-      </w:r>
-      <w:r>
-        <w:t>ụ</w:t>
-      </w:r>
-      <w:r>
-        <w:t>c c</w:t>
-      </w:r>
-      <w:r>
-        <w:t>ấ</w:t>
-      </w:r>
-      <w:r>
-        <w:t>p phát thêm b</w:t>
-      </w:r>
-      <w:r>
-        <w:t>ộ</w:t>
-      </w:r>
-      <w:r>
-        <w:t xml:space="preserve"> nh</w:t>
-      </w:r>
-      <w:r>
-        <w:t>ớ</w:t>
-      </w:r>
-      <w:r>
-        <w:t xml:space="preserve"> ph</w:t>
-      </w:r>
-      <w:r>
-        <w:t>ụ</w:t>
-      </w:r>
-      <w:r>
-        <w:t xml:space="preserve"> và t</w:t>
-      </w:r>
-      <w:r>
-        <w:t>ố</w:t>
-      </w:r>
-      <w:r>
-        <w:t>n chi phí cho thao tác sao chép khi tr</w:t>
-      </w:r>
-      <w:r>
-        <w:t>ộ</w:t>
-      </w:r>
-      <w:r>
-        <w:t>n (merge) các m</w:t>
-      </w:r>
-      <w:r>
-        <w:t>ả</w:t>
-      </w:r>
-      <w:r>
-        <w:t>ng con.</w:t>
+        <w:t>- MergeSort: Bám sát ngay sau QuickSort với 5076.43 ms. Sự chênh lệch nhẹ này chủ yếu đến từ việc MergeSort phải liên tục cấp phát thêm bộ nhớ phụ và tốn chi phí cho thao tác sao chép khi trộn (merge) các mảng con.</w:t>
       </w:r>
       <w:r>
         <w:br/>
-        <w:t>- HeapSort: Cho k</w:t>
-      </w:r>
-      <w:r>
-        <w:t>ế</w:t>
-      </w:r>
-      <w:r>
-        <w:t>t qu</w:t>
-      </w:r>
-      <w:r>
-        <w:t>ả</w:t>
-      </w:r>
-      <w:r>
-        <w:t xml:space="preserve"> kém nh</w:t>
-      </w:r>
-      <w:r>
-        <w:t>ấ</w:t>
-      </w:r>
-      <w:r>
-        <w:t>t trong</w:t>
-      </w:r>
-      <w:r>
-        <w:t xml:space="preserve"> đ</w:t>
-      </w:r>
-      <w:r>
-        <w:t>ợ</w:t>
-      </w:r>
-      <w:r>
-        <w:t>t th</w:t>
-      </w:r>
-      <w:r>
-        <w:t>ử</w:t>
-      </w:r>
-      <w:r>
-        <w:t xml:space="preserve"> nghi</w:t>
-      </w:r>
-      <w:r>
-        <w:t>ệ</w:t>
-      </w:r>
-      <w:r>
-        <w:t>m này (trung bình 10786.86 ms), ch</w:t>
-      </w:r>
-      <w:r>
-        <w:t>ậ</w:t>
-      </w:r>
-      <w:r>
-        <w:t>m hơn QuickSort và MergeSort kho</w:t>
-      </w:r>
-      <w:r>
-        <w:t>ả</w:t>
-      </w:r>
-      <w:r>
-        <w:t>ng hơn 2 l</w:t>
-      </w:r>
-      <w:r>
-        <w:t>ầ</w:t>
-      </w:r>
-      <w:r>
-        <w:t>n.</w:t>
+        <w:t>- HeapSort: Cho kết quả kém nhất trong đợt thử nghiệm này (trung bình 10786.86 ms), chậm hơn QuickSort và MergeSort khoảng hơn 2 lần.</w:t>
       </w:r>
     </w:p>
     <w:p>
@@ -2187,415 +934,16 @@
         <w:rPr>
           <w:b/>
         </w:rPr>
-        <w:t xml:space="preserve">2. Đánh giá tính </w:t>
-      </w:r>
-      <w:r>
-        <w:rPr>
-          <w:b/>
-        </w:rPr>
-        <w:t>ổ</w:t>
-      </w:r>
-      <w:r>
-        <w:rPr>
-          <w:b/>
-        </w:rPr>
-        <w:t>n đ</w:t>
-      </w:r>
-      <w:r>
-        <w:rPr>
-          <w:b/>
-        </w:rPr>
-        <w:t>ị</w:t>
-      </w:r>
-      <w:r>
-        <w:rPr>
-          <w:b/>
-        </w:rPr>
-        <w:t>nh</w:t>
+        <w:t>2. Đánh giá tính ổn định</w:t>
       </w:r>
     </w:p>
     <w:p>
       <w:r>
-        <w:t>V</w:t>
-      </w:r>
-      <w:r>
-        <w:t>ề</w:t>
-      </w:r>
-      <w:r>
-        <w:t xml:space="preserve"> cơ b</w:t>
-      </w:r>
-      <w:r>
-        <w:t>ả</w:t>
-      </w:r>
-      <w:r>
-        <w:t>n, hi</w:t>
-      </w:r>
-      <w:r>
-        <w:t>ệ</w:t>
-      </w:r>
-      <w:r>
-        <w:t>u năng c</w:t>
-      </w:r>
-      <w:r>
-        <w:t>ủ</w:t>
-      </w:r>
-      <w:r>
-        <w:t>a các thu</w:t>
-      </w:r>
-      <w:r>
-        <w:t>ậ</w:t>
-      </w:r>
-      <w:r>
-        <w:t>t toán đ</w:t>
-      </w:r>
-      <w:r>
-        <w:t>ề</w:t>
-      </w:r>
-      <w:r>
-        <w:t>u tương đ</w:t>
-      </w:r>
-      <w:r>
-        <w:t>ố</w:t>
-      </w:r>
-      <w:r>
-        <w:t>i đ</w:t>
-      </w:r>
-      <w:r>
-        <w:t>ồ</w:t>
-      </w:r>
-      <w:r>
-        <w:t>ng đ</w:t>
-      </w:r>
-      <w:r>
-        <w:t>ề</w:t>
-      </w:r>
-      <w:r>
-        <w:t>u khi ch</w:t>
-      </w:r>
-      <w:r>
-        <w:t>ạ</w:t>
-      </w:r>
-      <w:r>
-        <w:t>y trên các dãy s</w:t>
-      </w:r>
-      <w:r>
-        <w:t>ố</w:t>
-      </w:r>
-      <w:r>
-        <w:t xml:space="preserve"> ng</w:t>
-      </w:r>
-      <w:r>
-        <w:t>ẫ</w:t>
-      </w:r>
-      <w:r>
-        <w:t>u nhiên hoàn toàn. Đi</w:t>
-      </w:r>
-      <w:r>
-        <w:t>ể</w:t>
-      </w:r>
-      <w:r>
-        <w:t>m đáng chú ý là nh</w:t>
-      </w:r>
-      <w:r>
-        <w:t>ờ</w:t>
-      </w:r>
-      <w:r>
-        <w:t xml:space="preserve"> vi</w:t>
-      </w:r>
-      <w:r>
-        <w:t>ệ</w:t>
-      </w:r>
-      <w:r>
-        <w:t>c ch</w:t>
-      </w:r>
-      <w:r>
-        <w:t>ọ</w:t>
-      </w:r>
-      <w:r>
-        <w:t>n ph</w:t>
-      </w:r>
-      <w:r>
-        <w:t>ầ</w:t>
-      </w:r>
-      <w:r>
-        <w:t>n t</w:t>
-      </w:r>
-      <w:r>
-        <w:t>ử</w:t>
-      </w:r>
-      <w:r>
-        <w:t xml:space="preserve"> ch</w:t>
-      </w:r>
-      <w:r>
-        <w:t>ố</w:t>
-      </w:r>
-      <w:r>
-        <w:t>t (pivot) m</w:t>
-      </w:r>
-      <w:r>
-        <w:t>ộ</w:t>
-      </w:r>
-      <w:r>
-        <w:t>t cách linh ho</w:t>
-      </w:r>
-      <w:r>
-        <w:t>ạ</w:t>
-      </w:r>
-      <w:r>
-        <w:t>t (ch</w:t>
-      </w:r>
-      <w:r>
-        <w:t>ọ</w:t>
-      </w:r>
-      <w:r>
-        <w:t>n ph</w:t>
-      </w:r>
-      <w:r>
-        <w:t>ầ</w:t>
-      </w:r>
-      <w:r>
-        <w:t>n t</w:t>
-      </w:r>
-      <w:r>
-        <w:t>ử</w:t>
-      </w:r>
-      <w:r>
-        <w:t xml:space="preserve"> </w:t>
-      </w:r>
-      <w:r>
-        <w:t>ở</w:t>
-      </w:r>
-      <w:r>
-        <w:t xml:space="preserve"> gi</w:t>
-      </w:r>
-      <w:r>
-        <w:t>ữ</w:t>
-      </w:r>
-      <w:r>
-        <w:t>a thay vì đ</w:t>
-      </w:r>
-      <w:r>
-        <w:t>ầ</w:t>
-      </w:r>
-      <w:r>
-        <w:t>u/cu</w:t>
-      </w:r>
-      <w:r>
-        <w:t>ố</w:t>
-      </w:r>
-      <w:r>
-        <w:t>i), QuickSort đã kh</w:t>
-      </w:r>
-      <w:r>
-        <w:t>ắ</w:t>
-      </w:r>
-      <w:r>
-        <w:t>c ph</w:t>
-      </w:r>
-      <w:r>
-        <w:t>ụ</w:t>
-      </w:r>
-      <w:r>
-        <w:t>c thành công y</w:t>
-      </w:r>
-      <w:r>
-        <w:t>ế</w:t>
-      </w:r>
-      <w:r>
-        <w:t>u đi</w:t>
-      </w:r>
-      <w:r>
-        <w:t>ể</w:t>
-      </w:r>
-      <w:r>
-        <w:t>m chí m</w:t>
-      </w:r>
-      <w:r>
-        <w:t>ạ</w:t>
-      </w:r>
-      <w:r>
-        <w:t>ng (trư</w:t>
-      </w:r>
-      <w:r>
-        <w:t>ờ</w:t>
-      </w:r>
-      <w:r>
-        <w:t>ng h</w:t>
-      </w:r>
-      <w:r>
-        <w:t>ợ</w:t>
-      </w:r>
-      <w:r>
-        <w:t>p O(n^2)) khi ph</w:t>
-      </w:r>
-      <w:r>
-        <w:t>ả</w:t>
-      </w:r>
-      <w:r>
-        <w:t>i x</w:t>
-      </w:r>
-      <w:r>
-        <w:t>ử</w:t>
-      </w:r>
-      <w:r>
-        <w:t xml:space="preserve"> lý các m</w:t>
-      </w:r>
-      <w:r>
-        <w:t>ả</w:t>
-      </w:r>
-      <w:r>
-        <w:t>ng d</w:t>
-      </w:r>
-      <w:r>
-        <w:t>ữ</w:t>
-      </w:r>
-      <w:r>
-        <w:t xml:space="preserve"> li</w:t>
-      </w:r>
-      <w:r>
-        <w:t>ệ</w:t>
-      </w:r>
-      <w:r>
-        <w:t>u đã đư</w:t>
-      </w:r>
-      <w:r>
-        <w:t>ợ</w:t>
-      </w:r>
-      <w:r>
-        <w:t>c s</w:t>
-      </w:r>
-      <w:r>
-        <w:t>ắ</w:t>
-      </w:r>
-      <w:r>
-        <w:t>p x</w:t>
-      </w:r>
-      <w:r>
-        <w:t>ế</w:t>
-      </w:r>
-      <w:r>
-        <w:t>p s</w:t>
-      </w:r>
-      <w:r>
-        <w:t>ẵ</w:t>
-      </w:r>
-      <w:r>
-        <w:t xml:space="preserve">n </w:t>
+        <w:t xml:space="preserve">Về cơ bản, hiệu năng của các thuật toán đều tương đối đồng đều khi chạy trên các dãy số ngẫu nhiên hoàn toàn. Điểm đáng chú ý là nhờ việc chọn phần tử chốt (pivot) một cách linh hoạt (chọn phần tử ở giữa thay vì đầu/cuối), QuickSort đã khắc phục thành công yếu điểm chí mạng (trường hợp O(n^2)) khi phải xử lý các mảng dữ liệu đã được sắp xếp sẵn </w:t>
       </w:r>
       <w:r>
         <w:lastRenderedPageBreak/>
-        <w:t>t</w:t>
-      </w:r>
-      <w:r>
-        <w:t>ừ</w:t>
-      </w:r>
-      <w:r>
-        <w:t xml:space="preserve"> trư</w:t>
-      </w:r>
-      <w:r>
-        <w:t>ớ</w:t>
-      </w:r>
-      <w:r>
-        <w:t>c. Nh</w:t>
-      </w:r>
-      <w:r>
-        <w:t>ờ</w:t>
-      </w:r>
-      <w:r>
-        <w:t xml:space="preserve"> v</w:t>
-      </w:r>
-      <w:r>
-        <w:t>ậ</w:t>
-      </w:r>
-      <w:r>
-        <w:t>y, QuickSort gi</w:t>
-      </w:r>
-      <w:r>
-        <w:t>ữ</w:t>
-      </w:r>
-      <w:r>
-        <w:t xml:space="preserve"> v</w:t>
-      </w:r>
-      <w:r>
-        <w:t>ữ</w:t>
-      </w:r>
-      <w:r>
-        <w:t>ng đư</w:t>
-      </w:r>
-      <w:r>
-        <w:t>ợ</w:t>
-      </w:r>
-      <w:r>
-        <w:t>c p</w:t>
-      </w:r>
-      <w:r>
-        <w:t>hong đ</w:t>
-      </w:r>
-      <w:r>
-        <w:t>ộ</w:t>
-      </w:r>
-      <w:r>
-        <w:t xml:space="preserve"> và tính </w:t>
-      </w:r>
-      <w:r>
-        <w:t>ổ</w:t>
-      </w:r>
-      <w:r>
-        <w:t>n đ</w:t>
-      </w:r>
-      <w:r>
-        <w:t>ị</w:t>
-      </w:r>
-      <w:r>
-        <w:t>nh ngang ng</w:t>
-      </w:r>
-      <w:r>
-        <w:t>ử</w:t>
-      </w:r>
-      <w:r>
-        <w:t>a v</w:t>
-      </w:r>
-      <w:r>
-        <w:t>ớ</w:t>
-      </w:r>
-      <w:r>
-        <w:t>i thu</w:t>
-      </w:r>
-      <w:r>
-        <w:t>ậ</w:t>
-      </w:r>
-      <w:r>
-        <w:t>t toán chia đ</w:t>
-      </w:r>
-      <w:r>
-        <w:t>ể</w:t>
-      </w:r>
-      <w:r>
-        <w:t xml:space="preserve"> tr</w:t>
-      </w:r>
-      <w:r>
-        <w:t>ị</w:t>
-      </w:r>
-      <w:r>
-        <w:t xml:space="preserve"> MergeSort trong m</w:t>
-      </w:r>
-      <w:r>
-        <w:t>ọ</w:t>
-      </w:r>
-      <w:r>
-        <w:t>i k</w:t>
-      </w:r>
-      <w:r>
-        <w:t>ị</w:t>
-      </w:r>
-      <w:r>
-        <w:t>ch b</w:t>
-      </w:r>
-      <w:r>
-        <w:t>ả</w:t>
-      </w:r>
-      <w:r>
-        <w:t>n.</w:t>
+        <w:t>từ trước. Nhờ vậy, QuickSort giữ vững được phong độ và tính ổn định ngang ngửa với thuật toán chia để trị MergeSort trong mọi kịch bản.</w:t>
       </w:r>
     </w:p>
     <w:p>
@@ -2603,381 +951,12 @@
         <w:rPr>
           <w:b/>
         </w:rPr>
-        <w:t>3. T</w:t>
-      </w:r>
-      <w:r>
-        <w:rPr>
-          <w:b/>
-        </w:rPr>
-        <w:t>ổ</w:t>
-      </w:r>
-      <w:r>
-        <w:rPr>
-          <w:b/>
-        </w:rPr>
-        <w:t>ng k</w:t>
-      </w:r>
-      <w:r>
-        <w:rPr>
-          <w:b/>
-        </w:rPr>
-        <w:t>ế</w:t>
-      </w:r>
-      <w:r>
-        <w:rPr>
-          <w:b/>
-        </w:rPr>
-        <w:t>t</w:t>
+        <w:t>3. Tổng kết</w:t>
       </w:r>
     </w:p>
     <w:p>
       <w:r>
-        <w:t>K</w:t>
-      </w:r>
-      <w:r>
-        <w:t>ế</w:t>
-      </w:r>
-      <w:r>
-        <w:t>t qu</w:t>
-      </w:r>
-      <w:r>
-        <w:t>ả</w:t>
-      </w:r>
-      <w:r>
-        <w:t xml:space="preserve"> th</w:t>
-      </w:r>
-      <w:r>
-        <w:t>ự</w:t>
-      </w:r>
-      <w:r>
-        <w:t>c t</w:t>
-      </w:r>
-      <w:r>
-        <w:t>ế</w:t>
-      </w:r>
-      <w:r>
-        <w:t xml:space="preserve"> đã ch</w:t>
-      </w:r>
-      <w:r>
-        <w:t>ứ</w:t>
-      </w:r>
-      <w:r>
-        <w:t>ng minh r</w:t>
-      </w:r>
-      <w:r>
-        <w:t>ằ</w:t>
-      </w:r>
-      <w:r>
-        <w:t>ng đánh giá qua đ</w:t>
-      </w:r>
-      <w:r>
-        <w:t>ộ</w:t>
-      </w:r>
-      <w:r>
-        <w:t xml:space="preserve"> ph</w:t>
-      </w:r>
-      <w:r>
-        <w:t>ứ</w:t>
-      </w:r>
-      <w:r>
-        <w:t>c t</w:t>
-      </w:r>
-      <w:r>
-        <w:t>ạ</w:t>
-      </w:r>
-      <w:r>
-        <w:t>p Big-O đôi khi ch</w:t>
-      </w:r>
-      <w:r>
-        <w:t>ỉ</w:t>
-      </w:r>
-      <w:r>
-        <w:t xml:space="preserve"> mang tính ch</w:t>
-      </w:r>
-      <w:r>
-        <w:t>ấ</w:t>
-      </w:r>
-      <w:r>
-        <w:t>t lý thuy</w:t>
-      </w:r>
-      <w:r>
-        <w:t>ế</w:t>
-      </w:r>
-      <w:r>
-        <w:t>t ti</w:t>
-      </w:r>
-      <w:r>
-        <w:t>ệ</w:t>
-      </w:r>
-      <w:r>
-        <w:t>m c</w:t>
-      </w:r>
-      <w:r>
-        <w:t>ậ</w:t>
-      </w:r>
-      <w:r>
-        <w:t>n. T</w:t>
-      </w:r>
-      <w:r>
-        <w:t>ố</w:t>
-      </w:r>
-      <w:r>
-        <w:t>c đ</w:t>
-      </w:r>
-      <w:r>
-        <w:t>ộ</w:t>
-      </w:r>
-      <w:r>
-        <w:t xml:space="preserve"> th</w:t>
-      </w:r>
-      <w:r>
-        <w:t>ự</w:t>
-      </w:r>
-      <w:r>
-        <w:t>c chi</w:t>
-      </w:r>
-      <w:r>
-        <w:t>ế</w:t>
-      </w:r>
-      <w:r>
-        <w:t>n c</w:t>
-      </w:r>
-      <w:r>
-        <w:t>ủ</w:t>
-      </w:r>
-      <w:r>
-        <w:t>a m</w:t>
-      </w:r>
-      <w:r>
-        <w:t>ộ</w:t>
-      </w:r>
-      <w:r>
-        <w:t xml:space="preserve">t chương trình </w:t>
-      </w:r>
-      <w:r>
-        <w:t>còn b</w:t>
-      </w:r>
-      <w:r>
-        <w:t>ị</w:t>
-      </w:r>
-      <w:r>
-        <w:t xml:space="preserve"> chi ph</w:t>
-      </w:r>
-      <w:r>
-        <w:t>ố</w:t>
-      </w:r>
-      <w:r>
-        <w:t>i r</w:t>
-      </w:r>
-      <w:r>
-        <w:t>ấ</w:t>
-      </w:r>
-      <w:r>
-        <w:t>t m</w:t>
-      </w:r>
-      <w:r>
-        <w:t>ạ</w:t>
-      </w:r>
-      <w:r>
-        <w:t>nh b</w:t>
-      </w:r>
-      <w:r>
-        <w:t>ở</w:t>
-      </w:r>
-      <w:r>
-        <w:t>i cơ ch</w:t>
-      </w:r>
-      <w:r>
-        <w:t>ế</w:t>
-      </w:r>
-      <w:r>
-        <w:t xml:space="preserve"> qu</w:t>
-      </w:r>
-      <w:r>
-        <w:t>ả</w:t>
-      </w:r>
-      <w:r>
-        <w:t>n lý b</w:t>
-      </w:r>
-      <w:r>
-        <w:t>ộ</w:t>
-      </w:r>
-      <w:r>
-        <w:t xml:space="preserve"> nh</w:t>
-      </w:r>
-      <w:r>
-        <w:t>ớ</w:t>
-      </w:r>
-      <w:r>
-        <w:t xml:space="preserve"> c</w:t>
-      </w:r>
-      <w:r>
-        <w:t>ủ</w:t>
-      </w:r>
-      <w:r>
-        <w:t>a Python cũng như ki</w:t>
-      </w:r>
-      <w:r>
-        <w:t>ế</w:t>
-      </w:r>
-      <w:r>
-        <w:t>n trúc ph</w:t>
-      </w:r>
-      <w:r>
-        <w:t>ầ</w:t>
-      </w:r>
-      <w:r>
-        <w:t>n c</w:t>
-      </w:r>
-      <w:r>
-        <w:t>ứ</w:t>
-      </w:r>
-      <w:r>
-        <w:t>ng. Do đó, khi ph</w:t>
-      </w:r>
-      <w:r>
-        <w:t>ả</w:t>
-      </w:r>
-      <w:r>
-        <w:t>i đ</w:t>
-      </w:r>
-      <w:r>
-        <w:t>ố</w:t>
-      </w:r>
-      <w:r>
-        <w:t>i m</w:t>
-      </w:r>
-      <w:r>
-        <w:t>ặ</w:t>
-      </w:r>
-      <w:r>
-        <w:t>t v</w:t>
-      </w:r>
-      <w:r>
-        <w:t>ớ</w:t>
-      </w:r>
-      <w:r>
-        <w:t>i lư</w:t>
-      </w:r>
-      <w:r>
-        <w:t>ợ</w:t>
-      </w:r>
-      <w:r>
-        <w:t>ng d</w:t>
-      </w:r>
-      <w:r>
-        <w:t>ữ</w:t>
-      </w:r>
-      <w:r>
-        <w:t xml:space="preserve"> li</w:t>
-      </w:r>
-      <w:r>
-        <w:t>ệ</w:t>
-      </w:r>
-      <w:r>
-        <w:t>u kh</w:t>
-      </w:r>
-      <w:r>
-        <w:t>ổ</w:t>
-      </w:r>
-      <w:r>
-        <w:t>ng l</w:t>
-      </w:r>
-      <w:r>
-        <w:t>ồ</w:t>
-      </w:r>
-      <w:r>
-        <w:t xml:space="preserve"> trong các bài toán th</w:t>
-      </w:r>
-      <w:r>
-        <w:t>ự</w:t>
-      </w:r>
-      <w:r>
-        <w:t>c ti</w:t>
-      </w:r>
-      <w:r>
-        <w:t>ễ</w:t>
-      </w:r>
-      <w:r>
-        <w:t>n, vi</w:t>
-      </w:r>
-      <w:r>
-        <w:t>ệ</w:t>
-      </w:r>
-      <w:r>
-        <w:t>c t</w:t>
-      </w:r>
-      <w:r>
-        <w:t>ậ</w:t>
-      </w:r>
-      <w:r>
-        <w:t>n d</w:t>
-      </w:r>
-      <w:r>
-        <w:t>ụ</w:t>
-      </w:r>
-      <w:r>
-        <w:t>ng các thư vi</w:t>
-      </w:r>
-      <w:r>
-        <w:t>ệ</w:t>
-      </w:r>
-      <w:r>
-        <w:t>n chu</w:t>
-      </w:r>
-      <w:r>
-        <w:t>ẩ</w:t>
-      </w:r>
-      <w:r>
-        <w:t>n đã đư</w:t>
-      </w:r>
-      <w:r>
-        <w:t>ợ</w:t>
-      </w:r>
-      <w:r>
-        <w:t>c t</w:t>
-      </w:r>
-      <w:r>
-        <w:t>ố</w:t>
-      </w:r>
-      <w:r>
-        <w:t>i ưu hóa s</w:t>
-      </w:r>
-      <w:r>
-        <w:t>ẵ</w:t>
-      </w:r>
-      <w:r>
-        <w:t>n như NumPy luôn là s</w:t>
-      </w:r>
-      <w:r>
-        <w:t>ự</w:t>
-      </w:r>
-      <w:r>
-        <w:t xml:space="preserve"> l</w:t>
-      </w:r>
-      <w:r>
-        <w:t>ự</w:t>
-      </w:r>
-      <w:r>
-        <w:t>a ch</w:t>
-      </w:r>
-      <w:r>
-        <w:t>ọ</w:t>
-      </w:r>
-      <w:r>
-        <w:t>n khôn ngoan và đáng tin c</w:t>
-      </w:r>
-      <w:r>
-        <w:t>ậ</w:t>
-      </w:r>
-      <w:r>
-        <w:t>y nh</w:t>
-      </w:r>
-      <w:r>
-        <w:t>ấ</w:t>
-      </w:r>
-      <w:r>
-        <w:t>t.</w:t>
+        <w:t>Kết quả thực tế đã chứng minh rằng đánh giá qua độ phức tạp Big-O đôi khi chỉ mang tính chất lý thuyết tiệm cận. Tốc độ thực chiến của một chương trình còn bị chi phối rất mạnh bởi cơ chế quản lý bộ nhớ của Python cũng như kiến trúc phần cứng. Do đó, khi phải đối mặt với lượng dữ liệu khổng lồ trong các bài toán thực tiễn, việc tận dụng các thư viện chuẩn đã được tối ưu hóa sẵn như NumPy luôn là sự lựa chọn khôn ngoan và đáng tin cậy nhất.</w:t>
       </w:r>
     </w:p>
     <w:sectPr>
@@ -14910,7 +12889,7 @@
 </file>
 
 <file path=customXml/itemProps1.xml><?xml version="1.0" encoding="utf-8"?>
-<ds:datastoreItem xmlns:ds="http://schemas.openxmlformats.org/officeDocument/2006/customXml" ds:itemID="{774F77F0-09A4-4A1C-B805-FE44FE66E735}">
+<ds:datastoreItem xmlns:ds="http://schemas.openxmlformats.org/officeDocument/2006/customXml" ds:itemID="{17C05A4D-84BB-45F0-A559-79BE0DDDD25B}">
   <ds:schemaRefs>
     <ds:schemaRef ds:uri="http://schemas.openxmlformats.org/officeDocument/2006/bibliography"/>
   </ds:schemaRefs>

</xml_diff>